<commit_message>
Perbaiki kode & deskripsi Sub-CPMK di Modul Word 7-9
Modul 7 memakai deskripsi Sub-CPMK 3.1 yang salah (fabrikasi, tidak
sesuai teks resmi di Asesmen-Optimalisasi-dan-Otomasi.json). Modul 8
dan 9 bahkan memakai kode Sub-CPMK 3.1 yang salah (seharusnya 3.2 dan
3.3 mengikuti urutan Modul-N). Cover dan bullet capaian pembelajaran
kini memakai teks literal dari JSON, dengan bullet elaborasi terpisah
yang menghubungkan ke konten teknis modul masing-masing.
</commit_message>
<xml_diff>
--- a/Optimalisasi-dan-Automasi/Modul-Word/Modul-7-Ekstraksi-Fitur-Domain-Frekuensi.docx
+++ b/Optimalisasi-dan-Automasi/Modul-Word/Modul-7-Ekstraksi-Fitur-Domain-Frekuensi.docx
@@ -468,7 +468,7 @@
                                 <w:szCs w:val="20"/>
                                 <w:lang w:val="fi-FI"/>
                               </w:rPr>
-                              <w:t xml:space="preserve">Sub-CPMK 3.1 – Mampu menerapkan algoritma optimasi (linear, non-linear, dan metaheuristik) untuk penyelesaian masalah rekayasa</w:t>
+                              <w:t xml:space="preserve">Sub-CPMK 3.1 – Mampu menggunakan metode simulasi yang tepat dalam desain sistem</w:t>
                             </w:r>
                             <w:r>
                               <w:rPr>
@@ -523,7 +523,7 @@
                           <w:szCs w:val="20"/>
                           <w:lang w:val="fi-FI"/>
                         </w:rPr>
-                        <w:t xml:space="preserve">Sub-CPMK 3.1 – Mampu menerapkan algoritma optimasi (linear, non-linear, dan metaheuristik) untuk penyelesaian masalah rekayasa</w:t>
+                        <w:t xml:space="preserve">Sub-CPMK 3.1 – Mampu menggunakan metode simulasi yang tepat dalam desain sistem</w:t>
                       </w:r>
                       <w:r>
                         <w:rPr>
@@ -2776,7 +2776,7 @@
           <w:i w:val="0"/>
           <w:sz w:val="22"/>
         </w:rPr>
-        <w:t>Mampu menerapkan algoritma optimasi (linear, non-linear, dan metaheuristik) untuk penyelesaian masalah rekayasa, yaitu membangun fondasi ekstraksi fitur frekuensi yang menjadi input bagi model optimasi dan machine learning pada pertemuan-pertemuan berikutnya (CPMK 3).</w:t>
+        <w:t>Mampu menggunakan metode simulasi yang tepat dalam desain sistem, yaitu memilih dan menerapkan metode ekstraksi fitur domain frekuensi (FFT, PSD, envelope analysis) yang tepat melalui simulasi Python sebagai dasar desain sistem monitoring kondisi mesin (CPMK 3).</w:t>
       </w:r>
     </w:p>
     <w:p>

</xml_diff>